<commit_message>
Remove all name placeholders; leave fields blank to be filled
The document previously carried bracketed placeholder names on the cover, in
the signature block and in the page footer. These are now blank fields.

- Cover: Prepared for, Prepared by, Proposal reference and Date of issue are
  empty rows for completion by hand.
- Signature block: no party names, only the fill lines.
- Page footer: dropped the name and the invented proposal reference; it now
  reads "Rev R0 | Page n of 25".
- Document metadata: creator cleared, so no name is embedded in the file.

Verified against the rendered PDF text and both the PDF and DOCX metadata.

Co-Authored-By: Claude Opus 5 <noreply@anthropic.com>
Claude-Session: https://claude.ai/code/session_011UfHU14BUqFguUajAUvB1J
</commit_message>
<xml_diff>
--- a/proposals/anantapur-wind-hydrology/Hydrology_Proposal_Anantapur_Wind_R0.docx
+++ b/proposals/anantapur-wind-hydrology/Hydrology_Proposal_Anantapur_Wind_R0.docx
@@ -199,7 +199,7 @@
                 <w:sz w:val="18"/>
                 <w:szCs w:val="18"/>
               </w:rPr>
-              <w:t xml:space="preserve">[Client / Developer name] — to be inserted</w:t>
+              <w:t xml:space="preserve"> </w:t>
             </w:r>
           </w:p>
         </w:tc>
@@ -255,7 +255,7 @@
                 <w:sz w:val="18"/>
                 <w:szCs w:val="18"/>
               </w:rPr>
-              <w:t xml:space="preserve">[Consultant name, address, CIN / GSTIN] — to be inserted</w:t>
+              <w:t xml:space="preserve"> </w:t>
             </w:r>
           </w:p>
         </w:tc>
@@ -313,7 +313,7 @@
                 <w:sz w:val="18"/>
                 <w:szCs w:val="18"/>
               </w:rPr>
-              <w:t xml:space="preserve">[REF/HYD/ATP/2026/01]</w:t>
+              <w:t xml:space="preserve"> </w:t>
             </w:r>
           </w:p>
         </w:tc>
@@ -427,7 +427,7 @@
                 <w:sz w:val="18"/>
                 <w:szCs w:val="18"/>
               </w:rPr>
-              <w:t xml:space="preserve">[insert date]</w:t>
+              <w:t xml:space="preserve"> </w:t>
             </w:r>
           </w:p>
         </w:tc>
@@ -17866,12 +17866,10 @@
             <w:r>
               <w:rPr>
                 <w:rFonts w:ascii="Calibri" w:cs="Calibri" w:eastAsia="Calibri" w:hAnsi="Calibri"/>
-                <w:b/>
-                <w:bCs/>
-                <w:sz w:val="18"/>
-                <w:szCs w:val="18"/>
-              </w:rPr>
-              <w:t xml:space="preserve">[Consultant name]</w:t>
+                <w:sz w:val="18"/>
+                <w:szCs w:val="18"/>
+              </w:rPr>
+              <w:t xml:space="preserve"> </w:t>
             </w:r>
           </w:p>
         </w:tc>
@@ -17895,12 +17893,10 @@
             <w:r>
               <w:rPr>
                 <w:rFonts w:ascii="Calibri" w:cs="Calibri" w:eastAsia="Calibri" w:hAnsi="Calibri"/>
-                <w:b/>
-                <w:bCs/>
-                <w:sz w:val="18"/>
-                <w:szCs w:val="18"/>
-              </w:rPr>
-              <w:t xml:space="preserve">[Client name]</w:t>
+                <w:sz w:val="18"/>
+                <w:szCs w:val="18"/>
+              </w:rPr>
+              <w:t xml:space="preserve"> </w:t>
             </w:r>
           </w:p>
         </w:tc>
@@ -18249,7 +18245,7 @@
         <w:sz w:val="16"/>
         <w:szCs w:val="16"/>
       </w:rPr>
-      <w:t xml:space="preserve">[Consultant name]   |   Ref [REF/HYD/ATP/2026/01] Rev R0   |   Page </w:t>
+      <w:t xml:space="preserve">Rev R0   |   Page </w:t>
     </w:r>
     <w:r>
       <w:rPr>

</xml_diff>

<commit_message>
Show programme duration on the cover
The 26-week programme was only stated in Section 9. Added it to the cover
summary table so the completion time is visible without opening the document.

Co-Authored-By: Claude Opus 5 <noreply@anthropic.com>
Claude-Session: https://claude.ai/code/session_011UfHU14BUqFguUajAUvB1J
</commit_message>
<xml_diff>
--- a/proposals/anantapur-wind-hydrology/Hydrology_Proposal_Anantapur_Wind_R0.docx
+++ b/proposals/anantapur-wind-hydrology/Hydrology_Proposal_Anantapur_Wind_R0.docx
@@ -457,7 +457,7 @@
                 <w:sz w:val="18"/>
                 <w:szCs w:val="18"/>
               </w:rPr>
-              <w:t xml:space="preserve">Validity</w:t>
+              <w:t xml:space="preserve">Programme</w:t>
             </w:r>
           </w:p>
         </w:tc>
@@ -483,7 +483,7 @@
                 <w:sz w:val="18"/>
                 <w:szCs w:val="18"/>
               </w:rPr>
-              <w:t xml:space="preserve">60 (sixty) days from date of issue</w:t>
+              <w:t xml:space="preserve">26 weeks from the effective start date (Section 9)</w:t>
             </w:r>
           </w:p>
         </w:tc>
@@ -514,7 +514,7 @@
                 <w:sz w:val="18"/>
                 <w:szCs w:val="18"/>
               </w:rPr>
-              <w:t xml:space="preserve">In response to</w:t>
+              <w:t xml:space="preserve">Validity</w:t>
             </w:r>
           </w:p>
         </w:tc>
@@ -522,6 +522,62 @@
           <w:tcPr>
             <w:tcW w:type="dxa" w:w="7146"/>
             <w:shd w:fill="EEF3F9" w:color="auto" w:val="clear"/>
+            <w:tcMar>
+              <w:top w:type="dxa" w:w="70"/>
+              <w:left w:type="dxa" w:w="110"/>
+              <w:bottom w:type="dxa" w:w="70"/>
+              <w:right w:type="dxa" w:w="110"/>
+            </w:tcMar>
+            <w:vAlign w:val="top"/>
+          </w:tcPr>
+          <w:p>
+            <w:pPr>
+              <w:spacing w:after="0" w:line="250"/>
+              <w:jc w:val="left"/>
+            </w:pPr>
+            <w:r>
+              <w:rPr>
+                <w:rFonts w:ascii="Calibri" w:cs="Calibri" w:eastAsia="Calibri" w:hAnsi="Calibri"/>
+                <w:sz w:val="18"/>
+                <w:szCs w:val="18"/>
+              </w:rPr>
+              <w:t xml:space="preserve">60 (sixty) days from date of issue</w:t>
+            </w:r>
+          </w:p>
+        </w:tc>
+      </w:tr>
+      <w:tr>
+        <w:tc>
+          <w:tcPr>
+            <w:tcW w:type="dxa" w:w="2600"/>
+            <w:tcMar>
+              <w:top w:type="dxa" w:w="70"/>
+              <w:left w:type="dxa" w:w="110"/>
+              <w:bottom w:type="dxa" w:w="70"/>
+              <w:right w:type="dxa" w:w="110"/>
+            </w:tcMar>
+            <w:vAlign w:val="top"/>
+          </w:tcPr>
+          <w:p>
+            <w:pPr>
+              <w:spacing w:after="0" w:line="250"/>
+              <w:jc w:val="left"/>
+            </w:pPr>
+            <w:r>
+              <w:rPr>
+                <w:rFonts w:ascii="Calibri" w:cs="Calibri" w:eastAsia="Calibri" w:hAnsi="Calibri"/>
+                <w:b/>
+                <w:bCs/>
+                <w:sz w:val="18"/>
+                <w:szCs w:val="18"/>
+              </w:rPr>
+              <w:t xml:space="preserve">In response to</w:t>
+            </w:r>
+          </w:p>
+        </w:tc>
+        <w:tc>
+          <w:tcPr>
+            <w:tcW w:type="dxa" w:w="7146"/>
             <w:tcMar>
               <w:top w:type="dxa" w:w="70"/>
               <w:left w:type="dxa" w:w="110"/>

</xml_diff>